<commit_message>
Use original new letterhead and fix A4 contract printing
</commit_message>
<xml_diff>
--- a/dist/Шаблон рассрочки.docx
+++ b/dist/Шаблон рассрочки.docx
@@ -2103,14 +2103,11 @@
     </w:tbl>
     <w:p/>
     <w:sectPr>
-      <w:headerReference w:type="even" r:id="rId6"/>
-      <w:headerReference w:type="default" r:id="rId7"/>
-      <w:footerReference w:type="even" r:id="rId8"/>
-      <w:footerReference w:type="default" r:id="rId9"/>
-      <w:headerReference w:type="first" r:id="rId10"/>
-      <w:footerReference w:type="first" r:id="rId11"/>
+      <w:headerReference w:type="first" r:id="letterheadRel0"/>
+      <w:footerReference w:type="default" r:id="letterheadRel1"/>
+      <w:footerReference w:type="first" r:id="letterheadRel2"/>
       <w:pgSz w:w="11900" w:h="16840"/>
-      <w:pgMar w:top="1588" w:right="851" w:bottom="1134" w:left="1701" w:header="714" w:footer="465" w:gutter="0"/>
+      <w:pgMar w:top="1588" w:right="851" w:bottom="1134" w:left="1701" w:header="716" w:footer="850" w:gutter="0"/>
       <w:cols w:space="708"/>
       <w:titlePg/>
       <w:docGrid w:linePitch="360"/>
@@ -2139,144 +2136,23 @@
 </file>
 
 <file path=word/footer1.xml><?xml version="1.0" encoding="utf-8"?>
-<w:ftr xmlns:wpc="http://schemas.microsoft.com/office/word/2010/wordprocessingCanvas" xmlns:cx="http://schemas.microsoft.com/office/drawing/2014/chartex" xmlns:cx1="http://schemas.microsoft.com/office/drawing/2015/9/8/chartex" xmlns:cx2="http://schemas.microsoft.com/office/drawing/2015/10/21/chartex" xmlns:cx3="http://schemas.microsoft.com/office/drawing/2016/5/9/chartex" xmlns:cx4="http://schemas.microsoft.com/office/drawing/2016/5/10/chartex" xmlns:cx5="http://schemas.microsoft.com/office/drawing/2016/5/11/chartex" xmlns:cx6="http://schemas.microsoft.com/office/drawing/2016/5/12/chartex" xmlns:cx7="http://schemas.microsoft.com/office/drawing/2016/5/13/chartex" xmlns:cx8="http://schemas.microsoft.com/office/drawing/2016/5/14/chartex" xmlns:mc="http://schemas.openxmlformats.org/markup-compatibility/2006" xmlns:aink="http://schemas.microsoft.com/office/drawing/2016/ink" xmlns:am3d="http://schemas.microsoft.com/office/drawing/2017/model3d" xmlns:o="urn:schemas-microsoft-com:office:office" xmlns:oel="http://schemas.microsoft.com/office/2019/extlst" xmlns:r="http://schemas.openxmlformats.org/officeDocument/2006/relationships" xmlns:m="http://schemas.openxmlformats.org/officeDocument/2006/math" xmlns:v="urn:schemas-microsoft-com:vml" xmlns:wp14="http://schemas.microsoft.com/office/word/2010/wordprocessingDrawing" xmlns:wp="http://schemas.openxmlformats.org/drawingml/2006/wordprocessingDrawing" xmlns:w10="urn:schemas-microsoft-com:office:word" xmlns:w="http://schemas.openxmlformats.org/wordprocessingml/2006/main" xmlns:w14="http://schemas.microsoft.com/office/word/2010/wordml" xmlns:w15="http://schemas.microsoft.com/office/word/2012/wordml" xmlns:w16cex="http://schemas.microsoft.com/office/word/2018/wordml/cex" xmlns:w16cid="http://schemas.microsoft.com/office/word/2016/wordml/cid" xmlns:w16="http://schemas.microsoft.com/office/word/2018/wordml" xmlns:w16du="http://schemas.microsoft.com/office/word/2023/wordml/word16du" xmlns:w16sdtdh="http://schemas.microsoft.com/office/word/2020/wordml/sdtdatahash" xmlns:w16se="http://schemas.microsoft.com/office/word/2015/wordml/symex" xmlns:wpg="http://schemas.microsoft.com/office/word/2010/wordprocessingGroup" xmlns:wpi="http://schemas.microsoft.com/office/word/2010/wordprocessingInk" xmlns:wne="http://schemas.microsoft.com/office/word/2006/wordml" xmlns:wps="http://schemas.microsoft.com/office/word/2010/wordprocessingShape" mc:Ignorable="w14 w15 w16se w16cid w16 w16cex w16sdtdh wp14">
-  <w:sdt>
-    <w:sdtPr>
-      <w:id w:val="696813152"/>
-      <w:docPartObj>
-        <w:docPartGallery w:val="Page Numbers (Bottom of Page)"/>
-        <w:docPartUnique/>
-      </w:docPartObj>
-    </w:sdtPr>
-    <w:sdtContent>
-      <w:p>
-        <w:pPr>
-          <w:pStyle w:val="af8"/>
-          <w:framePr w:wrap="none" w:vAnchor="text" w:hAnchor="margin" w:xAlign="center" w:y="1"/>
-          <w:rPr>
-            <w:rStyle w:val="afc"/>
-          </w:rPr>
-        </w:pPr>
-        <w:r>
-          <w:rPr>
-            <w:rStyle w:val="afc"/>
-          </w:rPr>
-          <w:fldChar w:fldCharType="begin"/>
-        </w:r>
-        <w:r>
-          <w:rPr>
-            <w:rStyle w:val="afc"/>
-          </w:rPr>
-          <w:instrText xml:space="preserve"> PAGE </w:instrText>
-        </w:r>
-        <w:r>
-          <w:rPr>
-            <w:rStyle w:val="afc"/>
-          </w:rPr>
-          <w:fldChar w:fldCharType="separate"/>
-        </w:r>
-        <w:r>
-          <w:rPr>
-            <w:rStyle w:val="afc"/>
-          </w:rPr>
-          <w:t>2</w:t>
-        </w:r>
-        <w:r>
-          <w:rPr>
-            <w:rStyle w:val="afc"/>
-          </w:rPr>
-          <w:fldChar w:fldCharType="end"/>
-        </w:r>
-      </w:p>
-    </w:sdtContent>
-  </w:sdt>
+<w:ftr xmlns:wpc="http://schemas.microsoft.com/office/word/2010/wordprocessingCanvas" xmlns:mc="http://schemas.openxmlformats.org/markup-compatibility/2006" xmlns:o="urn:schemas-microsoft-com:office:office" xmlns:r="http://schemas.openxmlformats.org/officeDocument/2006/relationships" xmlns:m="http://schemas.openxmlformats.org/officeDocument/2006/math" xmlns:v="urn:schemas-microsoft-com:vml" xmlns:wp14="http://schemas.microsoft.com/office/word/2010/wordprocessingDrawing" xmlns:wp="http://schemas.openxmlformats.org/drawingml/2006/wordprocessingDrawing" xmlns:w10="urn:schemas-microsoft-com:office:word" xmlns:w="http://schemas.openxmlformats.org/wordprocessingml/2006/main" xmlns:w14="http://schemas.microsoft.com/office/word/2010/wordml" xmlns:w15="http://schemas.microsoft.com/office/word/2012/wordml" xmlns:wpg="http://schemas.microsoft.com/office/word/2010/wordprocessingGroup" xmlns:wpi="http://schemas.microsoft.com/office/word/2010/wordprocessingInk" xmlns:wne="http://schemas.microsoft.com/office/word/2006/wordml" xmlns:a="http://schemas.openxmlformats.org/drawingml/2006/main" xmlns:wps="http://schemas.microsoft.com/office/word/2010/wordprocessingShape" mc:Ignorable="w14 w15 wp14">
   <w:p>
     <w:pPr>
-      <w:pStyle w:val="af8"/>
-    </w:pPr>
-  </w:p>
-</w:ftr>
-</file>
-
-<file path=word/footer2.xml><?xml version="1.0" encoding="utf-8"?>
-<w:ftr xmlns:wpc="http://schemas.microsoft.com/office/word/2010/wordprocessingCanvas" xmlns:cx="http://schemas.microsoft.com/office/drawing/2014/chartex" xmlns:cx1="http://schemas.microsoft.com/office/drawing/2015/9/8/chartex" xmlns:cx2="http://schemas.microsoft.com/office/drawing/2015/10/21/chartex" xmlns:cx3="http://schemas.microsoft.com/office/drawing/2016/5/9/chartex" xmlns:cx4="http://schemas.microsoft.com/office/drawing/2016/5/10/chartex" xmlns:cx5="http://schemas.microsoft.com/office/drawing/2016/5/11/chartex" xmlns:cx6="http://schemas.microsoft.com/office/drawing/2016/5/12/chartex" xmlns:cx7="http://schemas.microsoft.com/office/drawing/2016/5/13/chartex" xmlns:cx8="http://schemas.microsoft.com/office/drawing/2016/5/14/chartex" xmlns:mc="http://schemas.openxmlformats.org/markup-compatibility/2006" xmlns:aink="http://schemas.microsoft.com/office/drawing/2016/ink" xmlns:am3d="http://schemas.microsoft.com/office/drawing/2017/model3d" xmlns:o="urn:schemas-microsoft-com:office:office" xmlns:oel="http://schemas.microsoft.com/office/2019/extlst" xmlns:r="http://schemas.openxmlformats.org/officeDocument/2006/relationships" xmlns:m="http://schemas.openxmlformats.org/officeDocument/2006/math" xmlns:v="urn:schemas-microsoft-com:vml" xmlns:wp14="http://schemas.microsoft.com/office/word/2010/wordprocessingDrawing" xmlns:wp="http://schemas.openxmlformats.org/drawingml/2006/wordprocessingDrawing" xmlns:w10="urn:schemas-microsoft-com:office:word" xmlns:w="http://schemas.openxmlformats.org/wordprocessingml/2006/main" xmlns:w14="http://schemas.microsoft.com/office/word/2010/wordml" xmlns:w15="http://schemas.microsoft.com/office/word/2012/wordml" xmlns:w16cex="http://schemas.microsoft.com/office/word/2018/wordml/cex" xmlns:w16cid="http://schemas.microsoft.com/office/word/2016/wordml/cid" xmlns:w16="http://schemas.microsoft.com/office/word/2018/wordml" xmlns:w16du="http://schemas.microsoft.com/office/word/2023/wordml/word16du" xmlns:w16sdtdh="http://schemas.microsoft.com/office/word/2020/wordml/sdtdatahash" xmlns:w16se="http://schemas.microsoft.com/office/word/2015/wordml/symex" xmlns:wpg="http://schemas.microsoft.com/office/word/2010/wordprocessingGroup" xmlns:wpi="http://schemas.microsoft.com/office/word/2010/wordprocessingInk" xmlns:wne="http://schemas.microsoft.com/office/word/2006/wordml" xmlns:wps="http://schemas.microsoft.com/office/word/2010/wordprocessingShape" mc:Ignorable="w14 w15 w16se w16cid w16 w16cex w16sdtdh wp14">
-  <w:sdt>
-    <w:sdtPr>
-      <w:id w:val="1811825542"/>
-      <w:docPartObj>
-        <w:docPartGallery w:val="Page Numbers (Bottom of Page)"/>
-        <w:docPartUnique/>
-      </w:docPartObj>
-    </w:sdtPr>
-    <w:sdtContent>
-      <w:p>
-        <w:pPr>
-          <w:pStyle w:val="af8"/>
-          <w:framePr w:wrap="none" w:vAnchor="text" w:hAnchor="page" w:x="5999" w:y="-23"/>
-          <w:jc w:val="center"/>
-          <w:rPr>
-            <w:rStyle w:val="afc"/>
-          </w:rPr>
-        </w:pPr>
-        <w:r>
-          <w:rPr>
-            <w:rStyle w:val="afc"/>
-          </w:rPr>
-          <w:fldChar w:fldCharType="begin"/>
-        </w:r>
-        <w:r>
-          <w:rPr>
-            <w:rStyle w:val="afc"/>
-          </w:rPr>
-          <w:instrText xml:space="preserve"> PAGE </w:instrText>
-        </w:r>
-        <w:r>
-          <w:rPr>
-            <w:rStyle w:val="afc"/>
-          </w:rPr>
-          <w:fldChar w:fldCharType="separate"/>
-        </w:r>
-        <w:r>
-          <w:rPr>
-            <w:rStyle w:val="afc"/>
-          </w:rPr>
-          <w:t>2</w:t>
-        </w:r>
-        <w:r>
-          <w:rPr>
-            <w:rStyle w:val="afc"/>
-          </w:rPr>
-          <w:fldChar w:fldCharType="end"/>
-        </w:r>
-      </w:p>
-    </w:sdtContent>
-  </w:sdt>
-  <w:p>
-    <w:pPr>
-      <w:pStyle w:val="af8"/>
-      <w:ind w:left="-709"/>
-    </w:pPr>
-  </w:p>
-  <w:p>
-    <w:pPr>
-      <w:pStyle w:val="af8"/>
+      <w:pStyle w:val="letterhead_923"/>
       <w:tabs>
-        <w:tab w:val="clear" w:pos="9355"/>
-        <w:tab w:val="right" w:pos="9349"/>
+        <w:tab w:val="right" w:pos="9329" w:leader="none"/>
+        <w:tab w:val="clear" w:pos="9355" w:leader="none"/>
       </w:tabs>
-      <w:ind w:left="-1276" w:hanging="425"/>
     </w:pPr>
     <w:r>
-      <w:rPr>
-        <w:noProof/>
-      </w:rPr>
       <mc:AlternateContent>
         <mc:Choice Requires="wpg">
           <w:drawing>
-            <wp:inline distT="0" distB="0" distL="0" distR="0" wp14:anchorId="4C08018B" wp14:editId="6A2FFD06">
-              <wp:extent cx="7704361" cy="104172"/>
+            <wp:inline xmlns:wp="http://schemas.openxmlformats.org/drawingml/2006/wordprocessingDrawing" distT="0" distB="0" distL="0" distR="0">
+              <wp:extent cx="5936616" cy="79375"/>
               <wp:effectExtent l="0" t="0" r="0" b="0"/>
-              <wp:docPr id="2" name="Рисунок 6"/>
+              <wp:docPr id="2" name="officeArt object" descr="Рисунок 6"/>
               <wp:cNvGraphicFramePr>
                 <a:graphicFrameLocks xmlns:a="http://schemas.openxmlformats.org/drawingml/2006/main" noChangeAspect="1"/>
               </wp:cNvGraphicFramePr>
@@ -2284,10 +2160,11 @@
                 <a:graphicData uri="http://schemas.openxmlformats.org/drawingml/2006/picture">
                   <pic:pic xmlns:pic="http://schemas.openxmlformats.org/drawingml/2006/picture">
                     <pic:nvPicPr>
-                      <pic:cNvPr id="6" name="1 Фирменный бланк СлышуВижу.png"/>
+                      <pic:cNvPr id="1073741825" name="Рисунок 6" descr="Рисунок 6"/>
                       <pic:cNvPicPr>
                         <a:picLocks noChangeAspect="1"/>
                       </pic:cNvPicPr>
+                      <pic:nvPr/>
                     </pic:nvPicPr>
                     <pic:blipFill>
                       <a:blip r:embed="rId1"/>
@@ -2296,11 +2173,16 @@
                     <pic:spPr bwMode="auto">
                       <a:xfrm>
                         <a:off x="0" y="0"/>
-                        <a:ext cx="10538344" cy="142491"/>
+                        <a:ext cx="5936616" cy="79375"/>
                       </a:xfrm>
                       <a:prstGeom prst="rect">
                         <a:avLst/>
                       </a:prstGeom>
+                      <a:ln w="12700" cap="flat">
+                        <a:noFill/>
+                        <a:miter lim="400000"/>
+                      </a:ln>
+                      <a:effectLst/>
                     </pic:spPr>
                   </pic:pic>
                 </a:graphicData>
@@ -2308,7 +2190,7 @@
             </wp:inline>
           </w:drawing>
         </mc:Choice>
-        <mc:Fallback xmlns:a="http://schemas.openxmlformats.org/drawingml/2006/main">
+        <mc:Fallback>
           <w:pict>
             <v:shapetype type="#_x0000_t75" o:spt="75" coordsize="21600,21600" o:preferrelative="t" path="m@4@5l@4@11@9@11@9@5xe">
               <v:formulas>
@@ -2326,40 +2208,38 @@
                 <v:f eqn="sum @10 21600 0"/>
               </v:formulas>
             </v:shapetype>
-            <v:shape id="_x0000_i1" o:spid="_x0000_s1" type="#_x0000_t75" style="width:606.64pt;height:8.20pt;mso-wrap-distance-left:0.00pt;mso-wrap-distance-top:0.00pt;mso-wrap-distance-right:0.00pt;mso-wrap-distance-bottom:0.00pt;" stroked="false">
+            <v:shape id="_x0000_i1" o:spid="_x0000_s1" type="#_x0000_t75" style="width:467.45pt;height:6.25pt;mso-wrap-distance-left:0.00pt;mso-wrap-distance-top:0.00pt;mso-wrap-distance-right:0.00pt;mso-wrap-distance-bottom:0.00pt;" stroked="f" strokeweight="1.00pt">
               <v:path textboxrect="0,0,0,0"/>
-              <v:imagedata r:id="rId2" o:title=""/>
+              <v:imagedata r:id="rId1" o:title=""/>
             </v:shape>
           </w:pict>
         </mc:Fallback>
       </mc:AlternateContent>
     </w:r>
+    <w:r/>
   </w:p>
 </w:ftr>
 </file>
 
-<file path=word/footer3.xml><?xml version="1.0" encoding="utf-8"?>
-<w:ftr xmlns:wpc="http://schemas.microsoft.com/office/word/2010/wordprocessingCanvas" xmlns:cx="http://schemas.microsoft.com/office/drawing/2014/chartex" xmlns:cx1="http://schemas.microsoft.com/office/drawing/2015/9/8/chartex" xmlns:cx2="http://schemas.microsoft.com/office/drawing/2015/10/21/chartex" xmlns:cx3="http://schemas.microsoft.com/office/drawing/2016/5/9/chartex" xmlns:cx4="http://schemas.microsoft.com/office/drawing/2016/5/10/chartex" xmlns:cx5="http://schemas.microsoft.com/office/drawing/2016/5/11/chartex" xmlns:cx6="http://schemas.microsoft.com/office/drawing/2016/5/12/chartex" xmlns:cx7="http://schemas.microsoft.com/office/drawing/2016/5/13/chartex" xmlns:cx8="http://schemas.microsoft.com/office/drawing/2016/5/14/chartex" xmlns:mc="http://schemas.openxmlformats.org/markup-compatibility/2006" xmlns:aink="http://schemas.microsoft.com/office/drawing/2016/ink" xmlns:am3d="http://schemas.microsoft.com/office/drawing/2017/model3d" xmlns:o="urn:schemas-microsoft-com:office:office" xmlns:oel="http://schemas.microsoft.com/office/2019/extlst" xmlns:r="http://schemas.openxmlformats.org/officeDocument/2006/relationships" xmlns:m="http://schemas.openxmlformats.org/officeDocument/2006/math" xmlns:v="urn:schemas-microsoft-com:vml" xmlns:wp14="http://schemas.microsoft.com/office/word/2010/wordprocessingDrawing" xmlns:wp="http://schemas.openxmlformats.org/drawingml/2006/wordprocessingDrawing" xmlns:w10="urn:schemas-microsoft-com:office:word" xmlns:w="http://schemas.openxmlformats.org/wordprocessingml/2006/main" xmlns:w14="http://schemas.microsoft.com/office/word/2010/wordml" xmlns:w15="http://schemas.microsoft.com/office/word/2012/wordml" xmlns:w16cex="http://schemas.microsoft.com/office/word/2018/wordml/cex" xmlns:w16cid="http://schemas.microsoft.com/office/word/2016/wordml/cid" xmlns:w16="http://schemas.microsoft.com/office/word/2018/wordml" xmlns:w16du="http://schemas.microsoft.com/office/word/2023/wordml/word16du" xmlns:w16sdtdh="http://schemas.microsoft.com/office/word/2020/wordml/sdtdatahash" xmlns:w16se="http://schemas.microsoft.com/office/word/2015/wordml/symex" xmlns:wpg="http://schemas.microsoft.com/office/word/2010/wordprocessingGroup" xmlns:wpi="http://schemas.microsoft.com/office/word/2010/wordprocessingInk" xmlns:wne="http://schemas.microsoft.com/office/word/2006/wordml" xmlns:wps="http://schemas.microsoft.com/office/word/2010/wordprocessingShape" mc:Ignorable="w14 w15 w16se w16cid w16 w16cex w16sdtdh wp14">
+<file path=word/footer2.xml><?xml version="1.0" encoding="utf-8"?>
+<w:ftr xmlns:wpc="http://schemas.microsoft.com/office/word/2010/wordprocessingCanvas" xmlns:mc="http://schemas.openxmlformats.org/markup-compatibility/2006" xmlns:o="urn:schemas-microsoft-com:office:office" xmlns:r="http://schemas.openxmlformats.org/officeDocument/2006/relationships" xmlns:m="http://schemas.openxmlformats.org/officeDocument/2006/math" xmlns:v="urn:schemas-microsoft-com:vml" xmlns:wp14="http://schemas.microsoft.com/office/word/2010/wordprocessingDrawing" xmlns:wp="http://schemas.openxmlformats.org/drawingml/2006/wordprocessingDrawing" xmlns:w10="urn:schemas-microsoft-com:office:word" xmlns:w="http://schemas.openxmlformats.org/wordprocessingml/2006/main" xmlns:w14="http://schemas.microsoft.com/office/word/2010/wordml" xmlns:w15="http://schemas.microsoft.com/office/word/2012/wordml" xmlns:wpg="http://schemas.microsoft.com/office/word/2010/wordprocessingGroup" xmlns:wpi="http://schemas.microsoft.com/office/word/2010/wordprocessingInk" xmlns:wne="http://schemas.microsoft.com/office/word/2006/wordml" xmlns:a="http://schemas.openxmlformats.org/drawingml/2006/main" xmlns:wps="http://schemas.microsoft.com/office/word/2010/wordprocessingShape" mc:Ignorable="w14 w15 wp14">
   <w:p>
     <w:pPr>
-      <w:pStyle w:val="af8"/>
-      <w:ind w:left="-1701" w:firstLine="567"/>
+      <w:pStyle w:val="letterhead_923"/>
       <w:jc w:val="center"/>
-      <w:rPr>
-        <w:lang w:val="en-US"/>
-      </w:rPr>
+      <w:tabs>
+        <w:tab w:val="right" w:pos="9329" w:leader="none"/>
+        <w:tab w:val="clear" w:pos="9355" w:leader="none"/>
+      </w:tabs>
     </w:pPr>
     <w:r>
-      <w:rPr>
-        <w:noProof/>
-      </w:rPr>
       <mc:AlternateContent>
         <mc:Choice Requires="wpg">
           <w:drawing>
-            <wp:inline distT="0" distB="0" distL="0" distR="0" wp14:anchorId="5BEACD8D" wp14:editId="59DC7A6E">
-              <wp:extent cx="5936615" cy="839060"/>
-              <wp:effectExtent l="0" t="0" r="6985" b="0"/>
-              <wp:docPr id="3" name="Рисунок 3"/>
+            <wp:inline xmlns:wp="http://schemas.openxmlformats.org/drawingml/2006/wordprocessingDrawing" distT="0" distB="0" distL="0" distR="0">
+              <wp:extent cx="5936615" cy="43180"/>
+              <wp:effectExtent l="0" t="0" r="0" b="0"/>
+              <wp:docPr id="3" name="officeArt object" descr="колонтитул5.png"/>
               <wp:cNvGraphicFramePr>
                 <a:graphicFrameLocks xmlns:a="http://schemas.openxmlformats.org/drawingml/2006/main" noChangeAspect="1"/>
               </wp:cNvGraphicFramePr>
@@ -2367,28 +2247,29 @@
                 <a:graphicData uri="http://schemas.openxmlformats.org/drawingml/2006/picture">
                   <pic:pic xmlns:pic="http://schemas.openxmlformats.org/drawingml/2006/picture">
                     <pic:nvPicPr>
-                      <pic:cNvPr id="0" name="Picture 1"/>
+                      <pic:cNvPr id="1073741827" name="колонтитул5.png" descr="колонтитул5.png"/>
                       <pic:cNvPicPr>
                         <a:picLocks noChangeAspect="1"/>
                       </pic:cNvPicPr>
+                      <pic:nvPr/>
                     </pic:nvPicPr>
                     <pic:blipFill>
                       <a:blip r:embed="rId1"/>
-                      <a:srcRect l="2838" r="2783"/>
                       <a:stretch/>
                     </pic:blipFill>
                     <pic:spPr bwMode="auto">
                       <a:xfrm>
                         <a:off x="0" y="0"/>
-                        <a:ext cx="5936615" cy="839060"/>
+                        <a:ext cx="5936615" cy="43180"/>
                       </a:xfrm>
                       <a:prstGeom prst="rect">
                         <a:avLst/>
                       </a:prstGeom>
-                      <a:noFill/>
-                      <a:ln>
+                      <a:ln w="12700" cap="flat">
                         <a:noFill/>
+                        <a:miter lim="400000"/>
                       </a:ln>
+                      <a:effectLst/>
                     </pic:spPr>
                   </pic:pic>
                 </a:graphicData>
@@ -2396,7 +2277,7 @@
             </wp:inline>
           </w:drawing>
         </mc:Choice>
-        <mc:Fallback xmlns:a="http://schemas.openxmlformats.org/drawingml/2006/main">
+        <mc:Fallback>
           <w:pict>
             <v:shapetype type="#_x0000_t75" o:spt="75" coordsize="21600,21600" o:preferrelative="t" path="m@4@5l@4@11@9@11@9@5xe">
               <v:formulas>
@@ -2414,14 +2295,15 @@
                 <v:f eqn="sum @10 21600 0"/>
               </v:formulas>
             </v:shapetype>
-            <v:shape id="_x0000_i2" o:spid="_x0000_s2" type="#_x0000_t75" style="width:467.45pt;height:66.07pt;mso-wrap-distance-left:0.00pt;mso-wrap-distance-top:0.00pt;mso-wrap-distance-right:0.00pt;mso-wrap-distance-bottom:0.00pt;" stroked="f">
+            <v:shape id="_x0000_i2" o:spid="_x0000_s2" type="#_x0000_t75" style="width:467.45pt;height:3.40pt;mso-wrap-distance-left:0.00pt;mso-wrap-distance-top:0.00pt;mso-wrap-distance-right:0.00pt;mso-wrap-distance-bottom:0.00pt;" stroked="f" strokeweight="1.00pt">
               <v:path textboxrect="0,0,0,0"/>
-              <v:imagedata r:id="rId2" o:title=""/>
+              <v:imagedata r:id="rId1" o:title=""/>
             </v:shape>
           </w:pict>
         </mc:Fallback>
       </mc:AlternateContent>
     </w:r>
+    <w:r/>
   </w:p>
 </w:ftr>
 </file>
@@ -2446,49 +2328,23 @@
 </file>
 
 <file path=word/header1.xml><?xml version="1.0" encoding="utf-8"?>
-<w:hdr xmlns:wpc="http://schemas.microsoft.com/office/word/2010/wordprocessingCanvas" xmlns:cx="http://schemas.microsoft.com/office/drawing/2014/chartex" xmlns:cx1="http://schemas.microsoft.com/office/drawing/2015/9/8/chartex" xmlns:cx2="http://schemas.microsoft.com/office/drawing/2015/10/21/chartex" xmlns:cx3="http://schemas.microsoft.com/office/drawing/2016/5/9/chartex" xmlns:cx4="http://schemas.microsoft.com/office/drawing/2016/5/10/chartex" xmlns:cx5="http://schemas.microsoft.com/office/drawing/2016/5/11/chartex" xmlns:cx6="http://schemas.microsoft.com/office/drawing/2016/5/12/chartex" xmlns:cx7="http://schemas.microsoft.com/office/drawing/2016/5/13/chartex" xmlns:cx8="http://schemas.microsoft.com/office/drawing/2016/5/14/chartex" xmlns:mc="http://schemas.openxmlformats.org/markup-compatibility/2006" xmlns:aink="http://schemas.microsoft.com/office/drawing/2016/ink" xmlns:am3d="http://schemas.microsoft.com/office/drawing/2017/model3d" xmlns:o="urn:schemas-microsoft-com:office:office" xmlns:oel="http://schemas.microsoft.com/office/2019/extlst" xmlns:r="http://schemas.openxmlformats.org/officeDocument/2006/relationships" xmlns:m="http://schemas.openxmlformats.org/officeDocument/2006/math" xmlns:v="urn:schemas-microsoft-com:vml" xmlns:wp14="http://schemas.microsoft.com/office/word/2010/wordprocessingDrawing" xmlns:wp="http://schemas.openxmlformats.org/drawingml/2006/wordprocessingDrawing" xmlns:w10="urn:schemas-microsoft-com:office:word" xmlns:w="http://schemas.openxmlformats.org/wordprocessingml/2006/main" xmlns:w14="http://schemas.microsoft.com/office/word/2010/wordml" xmlns:w15="http://schemas.microsoft.com/office/word/2012/wordml" xmlns:w16cex="http://schemas.microsoft.com/office/word/2018/wordml/cex" xmlns:w16cid="http://schemas.microsoft.com/office/word/2016/wordml/cid" xmlns:w16="http://schemas.microsoft.com/office/word/2018/wordml" xmlns:w16du="http://schemas.microsoft.com/office/word/2023/wordml/word16du" xmlns:w16sdtdh="http://schemas.microsoft.com/office/word/2020/wordml/sdtdatahash" xmlns:w16se="http://schemas.microsoft.com/office/word/2015/wordml/symex" xmlns:wpg="http://schemas.microsoft.com/office/word/2010/wordprocessingGroup" xmlns:wpi="http://schemas.microsoft.com/office/word/2010/wordprocessingInk" xmlns:wne="http://schemas.microsoft.com/office/word/2006/wordml" xmlns:wps="http://schemas.microsoft.com/office/word/2010/wordprocessingShape" mc:Ignorable="w14 w15 w16se w16cid w16 w16cex w16sdtdh wp14">
+<w:hdr xmlns:wpc="http://schemas.microsoft.com/office/word/2010/wordprocessingCanvas" xmlns:mc="http://schemas.openxmlformats.org/markup-compatibility/2006" xmlns:o="urn:schemas-microsoft-com:office:office" xmlns:r="http://schemas.openxmlformats.org/officeDocument/2006/relationships" xmlns:m="http://schemas.openxmlformats.org/officeDocument/2006/math" xmlns:v="urn:schemas-microsoft-com:vml" xmlns:wp14="http://schemas.microsoft.com/office/word/2010/wordprocessingDrawing" xmlns:wp="http://schemas.openxmlformats.org/drawingml/2006/wordprocessingDrawing" xmlns:w10="urn:schemas-microsoft-com:office:word" xmlns:w="http://schemas.openxmlformats.org/wordprocessingml/2006/main" xmlns:w14="http://schemas.microsoft.com/office/word/2010/wordml" xmlns:w15="http://schemas.microsoft.com/office/word/2012/wordml" xmlns:wpg="http://schemas.microsoft.com/office/word/2010/wordprocessingGroup" xmlns:wpi="http://schemas.microsoft.com/office/word/2010/wordprocessingInk" xmlns:wne="http://schemas.microsoft.com/office/word/2006/wordml" xmlns:a="http://schemas.openxmlformats.org/drawingml/2006/main" xmlns:wps="http://schemas.microsoft.com/office/word/2010/wordprocessingShape" mc:Ignorable="w14 w15 wp14">
   <w:p>
     <w:pPr>
-      <w:pStyle w:val="af6"/>
-    </w:pPr>
-  </w:p>
-</w:hdr>
-</file>
-
-<file path=word/header2.xml><?xml version="1.0" encoding="utf-8"?>
-<w:hdr xmlns:wpc="http://schemas.microsoft.com/office/word/2010/wordprocessingCanvas" xmlns:cx="http://schemas.microsoft.com/office/drawing/2014/chartex" xmlns:cx1="http://schemas.microsoft.com/office/drawing/2015/9/8/chartex" xmlns:cx2="http://schemas.microsoft.com/office/drawing/2015/10/21/chartex" xmlns:cx3="http://schemas.microsoft.com/office/drawing/2016/5/9/chartex" xmlns:cx4="http://schemas.microsoft.com/office/drawing/2016/5/10/chartex" xmlns:cx5="http://schemas.microsoft.com/office/drawing/2016/5/11/chartex" xmlns:cx6="http://schemas.microsoft.com/office/drawing/2016/5/12/chartex" xmlns:cx7="http://schemas.microsoft.com/office/drawing/2016/5/13/chartex" xmlns:cx8="http://schemas.microsoft.com/office/drawing/2016/5/14/chartex" xmlns:mc="http://schemas.openxmlformats.org/markup-compatibility/2006" xmlns:aink="http://schemas.microsoft.com/office/drawing/2016/ink" xmlns:am3d="http://schemas.microsoft.com/office/drawing/2017/model3d" xmlns:o="urn:schemas-microsoft-com:office:office" xmlns:oel="http://schemas.microsoft.com/office/2019/extlst" xmlns:r="http://schemas.openxmlformats.org/officeDocument/2006/relationships" xmlns:m="http://schemas.openxmlformats.org/officeDocument/2006/math" xmlns:v="urn:schemas-microsoft-com:vml" xmlns:wp14="http://schemas.microsoft.com/office/word/2010/wordprocessingDrawing" xmlns:wp="http://schemas.openxmlformats.org/drawingml/2006/wordprocessingDrawing" xmlns:w10="urn:schemas-microsoft-com:office:word" xmlns:w="http://schemas.openxmlformats.org/wordprocessingml/2006/main" xmlns:w14="http://schemas.microsoft.com/office/word/2010/wordml" xmlns:w15="http://schemas.microsoft.com/office/word/2012/wordml" xmlns:w16cex="http://schemas.microsoft.com/office/word/2018/wordml/cex" xmlns:w16cid="http://schemas.microsoft.com/office/word/2016/wordml/cid" xmlns:w16="http://schemas.microsoft.com/office/word/2018/wordml" xmlns:w16du="http://schemas.microsoft.com/office/word/2023/wordml/word16du" xmlns:w16sdtdh="http://schemas.microsoft.com/office/word/2020/wordml/sdtdatahash" xmlns:w16se="http://schemas.microsoft.com/office/word/2015/wordml/symex" xmlns:wpg="http://schemas.microsoft.com/office/word/2010/wordprocessingGroup" xmlns:wpi="http://schemas.microsoft.com/office/word/2010/wordprocessingInk" xmlns:wne="http://schemas.microsoft.com/office/word/2006/wordml" xmlns:wps="http://schemas.microsoft.com/office/word/2010/wordprocessingShape" mc:Ignorable="w14 w15 w16se w16cid w16 w16cex w16sdtdh wp14">
-  <w:p>
-    <w:pPr>
-      <w:pStyle w:val="af6"/>
-      <w:ind w:left="-567" w:hanging="284"/>
-    </w:pPr>
-  </w:p>
-  <w:p>
-    <w:pPr>
-      <w:pStyle w:val="af6"/>
-    </w:pPr>
-  </w:p>
-</w:hdr>
-</file>
-
-<file path=word/header3.xml><?xml version="1.0" encoding="utf-8"?>
-<w:hdr xmlns:wpc="http://schemas.microsoft.com/office/word/2010/wordprocessingCanvas" xmlns:cx="http://schemas.microsoft.com/office/drawing/2014/chartex" xmlns:cx1="http://schemas.microsoft.com/office/drawing/2015/9/8/chartex" xmlns:cx2="http://schemas.microsoft.com/office/drawing/2015/10/21/chartex" xmlns:cx3="http://schemas.microsoft.com/office/drawing/2016/5/9/chartex" xmlns:cx4="http://schemas.microsoft.com/office/drawing/2016/5/10/chartex" xmlns:cx5="http://schemas.microsoft.com/office/drawing/2016/5/11/chartex" xmlns:cx6="http://schemas.microsoft.com/office/drawing/2016/5/12/chartex" xmlns:cx7="http://schemas.microsoft.com/office/drawing/2016/5/13/chartex" xmlns:cx8="http://schemas.microsoft.com/office/drawing/2016/5/14/chartex" xmlns:mc="http://schemas.openxmlformats.org/markup-compatibility/2006" xmlns:aink="http://schemas.microsoft.com/office/drawing/2016/ink" xmlns:am3d="http://schemas.microsoft.com/office/drawing/2017/model3d" xmlns:o="urn:schemas-microsoft-com:office:office" xmlns:oel="http://schemas.microsoft.com/office/2019/extlst" xmlns:r="http://schemas.openxmlformats.org/officeDocument/2006/relationships" xmlns:m="http://schemas.openxmlformats.org/officeDocument/2006/math" xmlns:v="urn:schemas-microsoft-com:vml" xmlns:wp14="http://schemas.microsoft.com/office/word/2010/wordprocessingDrawing" xmlns:wp="http://schemas.openxmlformats.org/drawingml/2006/wordprocessingDrawing" xmlns:w10="urn:schemas-microsoft-com:office:word" xmlns:w="http://schemas.openxmlformats.org/wordprocessingml/2006/main" xmlns:w14="http://schemas.microsoft.com/office/word/2010/wordml" xmlns:w15="http://schemas.microsoft.com/office/word/2012/wordml" xmlns:w16cex="http://schemas.microsoft.com/office/word/2018/wordml/cex" xmlns:w16cid="http://schemas.microsoft.com/office/word/2016/wordml/cid" xmlns:w16="http://schemas.microsoft.com/office/word/2018/wordml" xmlns:w16du="http://schemas.microsoft.com/office/word/2023/wordml/word16du" xmlns:w16sdtdh="http://schemas.microsoft.com/office/word/2020/wordml/sdtdatahash" xmlns:w16se="http://schemas.microsoft.com/office/word/2015/wordml/symex" xmlns:wpg="http://schemas.microsoft.com/office/word/2010/wordprocessingGroup" xmlns:wpi="http://schemas.microsoft.com/office/word/2010/wordprocessingInk" xmlns:wne="http://schemas.microsoft.com/office/word/2006/wordml" xmlns:wps="http://schemas.microsoft.com/office/word/2010/wordprocessingShape" mc:Ignorable="w14 w15 w16se w16cid w16 w16cex w16sdtdh wp14">
-  <w:p>
-    <w:pPr>
-      <w:pStyle w:val="af6"/>
-      <w:ind w:left="-851" w:hanging="142"/>
+      <w:pStyle w:val="letterhead_924"/>
+      <w:tabs>
+        <w:tab w:val="right" w:pos="9329" w:leader="none"/>
+        <w:tab w:val="clear" w:pos="9355" w:leader="none"/>
+      </w:tabs>
     </w:pPr>
     <w:r>
-      <w:rPr>
-        <w:noProof/>
-      </w:rPr>
       <mc:AlternateContent>
         <mc:Choice Requires="wpg">
           <w:drawing>
-            <wp:inline distT="0" distB="0" distL="0" distR="0" wp14:anchorId="4E0AAC9D" wp14:editId="0A8CF049">
-              <wp:extent cx="1689100" cy="723900"/>
+            <wp:inline xmlns:wp="http://schemas.openxmlformats.org/drawingml/2006/wordprocessingDrawing" distT="0" distB="0" distL="0" distR="0">
+              <wp:extent cx="1942565" cy="510286"/>
               <wp:effectExtent l="0" t="0" r="0" b="0"/>
-              <wp:docPr id="1" name="Рисунок 2"/>
+              <wp:docPr id="1" name="officeArt object" descr="слышувижу.png"/>
               <wp:cNvGraphicFramePr>
                 <a:graphicFrameLocks xmlns:a="http://schemas.openxmlformats.org/drawingml/2006/main" noChangeAspect="1"/>
               </wp:cNvGraphicFramePr>
@@ -2496,10 +2352,11 @@
                 <a:graphicData uri="http://schemas.openxmlformats.org/drawingml/2006/picture">
                   <pic:pic xmlns:pic="http://schemas.openxmlformats.org/drawingml/2006/picture">
                     <pic:nvPicPr>
-                      <pic:cNvPr id="2" name="Рисунок 2"/>
+                      <pic:cNvPr id="1073741826" name="слышувижу.png" descr="слышувижу.png"/>
                       <pic:cNvPicPr>
                         <a:picLocks noChangeAspect="1"/>
                       </pic:cNvPicPr>
+                      <pic:nvPr/>
                     </pic:nvPicPr>
                     <pic:blipFill>
                       <a:blip r:embed="rId1"/>
@@ -2508,11 +2365,16 @@
                     <pic:spPr bwMode="auto">
                       <a:xfrm>
                         <a:off x="0" y="0"/>
-                        <a:ext cx="1689100" cy="723900"/>
+                        <a:ext cx="1942565" cy="510286"/>
                       </a:xfrm>
                       <a:prstGeom prst="rect">
                         <a:avLst/>
                       </a:prstGeom>
+                      <a:ln w="12700" cap="flat">
+                        <a:noFill/>
+                        <a:miter lim="400000"/>
+                      </a:ln>
+                      <a:effectLst/>
                     </pic:spPr>
                   </pic:pic>
                 </a:graphicData>
@@ -2520,7 +2382,7 @@
             </wp:inline>
           </w:drawing>
         </mc:Choice>
-        <mc:Fallback xmlns:a="http://schemas.openxmlformats.org/drawingml/2006/main">
+        <mc:Fallback>
           <w:pict>
             <v:shapetype type="#_x0000_t75" o:spt="75" coordsize="21600,21600" o:preferrelative="t" path="m@4@5l@4@11@9@11@9@5xe">
               <v:formulas>
@@ -2538,14 +2400,37 @@
                 <v:f eqn="sum @10 21600 0"/>
               </v:formulas>
             </v:shapetype>
-            <v:shape id="_x0000_i0" o:spid="_x0000_s0" type="#_x0000_t75" style="width:133.00pt;height:57.00pt;mso-wrap-distance-left:0.00pt;mso-wrap-distance-top:0.00pt;mso-wrap-distance-right:0.00pt;mso-wrap-distance-bottom:0.00pt;" stroked="false">
+            <v:shape id="_x0000_i0" o:spid="_x0000_s0" type="#_x0000_t75" style="width:152.96pt;height:40.18pt;mso-wrap-distance-left:0.00pt;mso-wrap-distance-top:0.00pt;mso-wrap-distance-right:0.00pt;mso-wrap-distance-bottom:0.00pt;" stroked="f" strokeweight="1.00pt">
               <v:path textboxrect="0,0,0,0"/>
-              <v:imagedata r:id="rId2" o:title=""/>
+              <v:imagedata r:id="rId1" o:title=""/>
             </v:shape>
           </w:pict>
         </mc:Fallback>
       </mc:AlternateContent>
     </w:r>
+    <w:r/>
+  </w:p>
+  <w:p>
+    <w:pPr>
+      <w:pStyle w:val="letterhead_924"/>
+      <w:tabs>
+        <w:tab w:val="right" w:pos="9329" w:leader="none"/>
+        <w:tab w:val="clear" w:pos="9355" w:leader="none"/>
+      </w:tabs>
+    </w:pPr>
+    <w:r/>
+    <w:r/>
+  </w:p>
+  <w:p>
+    <w:pPr>
+      <w:pStyle w:val="letterhead_924"/>
+      <w:tabs>
+        <w:tab w:val="right" w:pos="9329" w:leader="none"/>
+        <w:tab w:val="clear" w:pos="9355" w:leader="none"/>
+      </w:tabs>
+    </w:pPr>
+    <w:r/>
+    <w:r/>
   </w:p>
 </w:hdr>
 </file>
@@ -14487,6 +14372,36 @@
       <w:lang w:eastAsia="ru-RU"/>
     </w:rPr>
   </w:style>
+  <w:style w:type="paragraph" w:styleId="letterhead_924">
+    <w:name w:val="Header"/>
+    <w:pPr>
+      <w:tabs>
+        <w:tab w:val="center" w:pos="4677" w:leader="none"/>
+        <w:tab w:val="right" w:pos="9355" w:leader="none"/>
+      </w:tabs>
+    </w:pPr>
+    <w:rPr>
+      <w:rFonts w:ascii="Tw Cen MT" w:hAnsi="Tw Cen MT" w:cs="Arial Unicode MS"/>
+      <w:color w:val="000000"/>
+      <w:sz w:val="24"/>
+      <w:szCs w:val="24"/>
+    </w:rPr>
+  </w:style>
+  <w:style w:type="paragraph" w:styleId="letterhead_923">
+    <w:name w:val="Footer"/>
+    <w:pPr>
+      <w:tabs>
+        <w:tab w:val="center" w:pos="4677" w:leader="none"/>
+        <w:tab w:val="right" w:pos="9355" w:leader="none"/>
+      </w:tabs>
+    </w:pPr>
+    <w:rPr>
+      <w:rFonts w:ascii="Tw Cen MT" w:hAnsi="Tw Cen MT" w:cs="Arial Unicode MS"/>
+      <w:color w:val="000000"/>
+      <w:sz w:val="24"/>
+      <w:szCs w:val="24"/>
+    </w:rPr>
+  </w:style>
 </w:styles>
 </file>
 

</xml_diff>